<commit_message>
changes projects and ats resume
</commit_message>
<xml_diff>
--- a/public/shimron-guray-ats-resume.docx
+++ b/public/shimron-guray-ats-resume.docx
@@ -278,7 +278,7 @@
         <w:rPr>
           <w:b/>
         </w:rPr>
-        <w:t>Hand Gesture Recognition System | 2026</w:t>
+        <w:t>Lightem Business Management Platform | Full-Stack Developer | 2024 - Present</w:t>
       </w:r>
     </w:p>
     <w:p>
@@ -288,7 +288,7 @@
         <w:ind w:left="259" w:hanging="173"/>
       </w:pPr>
       <w:r>
-        <w:t>Built a real-time desktop application for hand tracking, custom gesture recognition, mouse control, and keyboard automation.</w:t>
+        <w:t>Frontend: Build responsive React interfaces and integrate tenant-aware workflows across accounting, inventory, POS, HRIS, payroll, sales, ticketing, and reporting modules.</w:t>
       </w:r>
     </w:p>
     <w:p>
@@ -298,7 +298,17 @@
         <w:ind w:left="259" w:hanging="173"/>
       </w:pPr>
       <w:r>
-        <w:t>Separated webcam capture, AI inference, and rendering into a multithreaded pipeline for responsive interaction.</w:t>
+        <w:t>Backend: Develop and maintain authenticated PHP JSON APIs, JWT access and refresh flows, business logic, validation, and MySQL data access through PDO.</w:t>
+      </w:r>
+    </w:p>
+    <w:p>
+      <w:pPr>
+        <w:pStyle w:val="ListBullet"/>
+        <w:spacing w:before="0" w:after="20" w:line="240" w:lineRule="auto"/>
+        <w:ind w:left="259" w:hanging="173"/>
+      </w:pPr>
+      <w:r>
+        <w:t>Connect frontend forms and server-state workflows to backend controllers and gateways while preserving reliable request and response contracts.</w:t>
       </w:r>
     </w:p>
     <w:p>
@@ -312,7 +322,7 @@
         <w:t xml:space="preserve">Technologies: </w:t>
       </w:r>
       <w:r>
-        <w:t>Python, MediaPipe, OpenCV, PySide6, NumPy, JSON, Computer Vision</w:t>
+        <w:t>React, Vite, JavaScript, Tailwind CSS, Material UI, React Query, Zustand, PHP 8.2, MySQL, PDO, REST APIs, JWT</w:t>
       </w:r>
     </w:p>
     <w:p>
@@ -323,7 +333,7 @@
         <w:rPr>
           <w:b/>
         </w:rPr>
-        <w:t>Python File Locker | 2026</w:t>
+        <w:t>Enrollment and Admission System | Backend Developer | 2023</w:t>
       </w:r>
     </w:p>
     <w:p>
@@ -333,7 +343,7 @@
         <w:ind w:left="259" w:hanging="173"/>
       </w:pPr>
       <w:r>
-        <w:t>Developed a desktop security application for encrypting files, folders, images, videos, and documents.</w:t>
+        <w:t>Developed server-side logic and REST APIs supporting student registration, enrollment, admission, and record-processing workflows.</w:t>
       </w:r>
     </w:p>
     <w:p>
@@ -343,7 +353,7 @@
         <w:ind w:left="259" w:hanging="173"/>
       </w:pPr>
       <w:r>
-        <w:t>Implemented authenticated encryption, Argon2id password derivation, encrypted metadata, compression, and optional key-file protection.</w:t>
+        <w:t>Integrated PHP and MySQL services with React and Tailwind CSS interfaces in collaboration with frontend developers.</w:t>
       </w:r>
     </w:p>
     <w:p>
@@ -357,7 +367,7 @@
         <w:t xml:space="preserve">Technologies: </w:t>
       </w:r>
       <w:r>
-        <w:t>Python, PySide6, AES-256-GCM, ChaCha20-Poly1305, Argon2id, PyInstaller</w:t>
+        <w:t>PHP, MySQL, React, Tailwind CSS, REST APIs, Postman</w:t>
       </w:r>
     </w:p>
     <w:p>

</xml_diff>